<commit_message>
Update report: refreshed clean screenshots (rich data) and reflection on fixes
- Recaptured screenshots via touch with sample data loaded (no debug border):
  Home, Diary, Editor, Tasks, Insights (full 2-week chart), Search, Settings
- Reflection now covers the overflow, blank-screen and setState-Future bugs
  found and fixed through device testing; notes mood-picker tests
- Settings wording updated to 'Load sample data'
</commit_message>
<xml_diff>
--- a/MindLog_CW2_Report.docx
+++ b/MindLog_CW2_Report.docx
@@ -72,7 +72,7 @@
         </w:rPr>
         <w:t xml:space="preserve">GitHub: </w:t>
       </w:r>
-      <w:hyperlink w:history="1" r:id="rIdwbyh32tewrdxelc_osnr3">
+      <w:hyperlink w:history="1" r:id="rIdxjex3bnwgljyefwalm8xn">
         <w:r>
           <w:rPr>
             <w:rStyle w:val="Hyperlink"/>
@@ -447,7 +447,7 @@
                 <w:sz w:val="20"/>
                 <w:szCs w:val="20"/>
               </w:rPr>
-              <w:t xml:space="preserve">Create, edit and delete journal entries with a title, body, date, mood and an optional photo from the camera or gallery.</w:t>
+              <w:t xml:space="preserve">Create, edit and delete entries with a title, body, date, mood and an optional photo from the camera or gallery.</w:t>
             </w:r>
           </w:p>
         </w:tc>
@@ -1015,7 +1015,7 @@
         <w:spacing w:after="120" w:line="276"/>
       </w:pPr>
       <w:r>
-        <w:t xml:space="preserve">Each module below is labelled with its developer (Chan Tai Yu for all modules) and illustrated with screenshots captured from the app running on an Android emulator.</w:t>
+        <w:t xml:space="preserve">Each module below is labelled with its developer (Chan Tai Yu for all modules) and illustrated with screenshots captured from the app running on an Android emulator with sample data loaded.</w:t>
       </w:r>
     </w:p>
     <w:p>
@@ -1347,7 +1347,7 @@
                 <wp:inline distT="0" distB="0" distL="0" distR="0">
                   <wp:extent cx="1571625" cy="3495675"/>
                   <wp:effectExtent t="0" r="0" b="0" l="0"/>
-                  <wp:docPr id="1" name="shot_editor.png" descr="New entry editor with mood picker" title="New entry editor with mood picker"/>
+                  <wp:docPr id="1" name="shot_editor.png" descr="Entry editor with the mood picker" title="Entry editor with the mood picker"/>
                   <wp:cNvGraphicFramePr>
                     <a:graphicFrameLocks xmlns:a="http://schemas.openxmlformats.org/drawingml/2006/main" noChangeAspect="1"/>
                   </wp:cNvGraphicFramePr>
@@ -1395,7 +1395,7 @@
                 <w:sz w:val="18"/>
                 <w:szCs w:val="18"/>
               </w:rPr>
-              <w:t xml:space="preserve">Figure 4: New entry editor with mood picker</w:t>
+              <w:t xml:space="preserve">Figure 4: Entry editor with the mood picker</w:t>
             </w:r>
           </w:p>
         </w:tc>
@@ -1497,7 +1497,7 @@
         <w:spacing w:after="120" w:line="276"/>
       </w:pPr>
       <w:r>
-        <w:t xml:space="preserve">The task planner is a lightweight to-do list. Users add a task with a single text field, tick it off when complete, and swipe to delete. A summary line shows how many tasks are open versus done. Crucially, each completed task records the time it was completed, which feeds the mood–productivity insight described next.</w:t>
+        <w:t xml:space="preserve">The task planner is a lightweight to-do list. Users type a task and press Add, tick it off when complete (it stays in the list with a strikethrough under the “done” count), and swipe left to delete. A summary line shows how many tasks are open versus done. Crucially, each completed task records the time it was completed, which feeds the mood–productivity insight described next.</w:t>
       </w:r>
     </w:p>
     <w:p>
@@ -1510,7 +1510,7 @@
           <wp:inline distT="0" distB="0" distL="0" distR="0">
             <wp:extent cx="1571625" cy="3495675"/>
             <wp:effectExtent t="0" r="0" b="0" l="0"/>
-            <wp:docPr id="1" name="shot_tasks.png" descr="Task planner with completed and outstanding tasks" title="Task planner with completed and outstanding tasks"/>
+            <wp:docPr id="1" name="shot_tasks.png" descr="Task planner with open and completed tasks" title="Task planner with open and completed tasks"/>
             <wp:cNvGraphicFramePr>
               <a:graphicFrameLocks xmlns:a="http://schemas.openxmlformats.org/drawingml/2006/main" noChangeAspect="1"/>
             </wp:cNvGraphicFramePr>
@@ -1559,7 +1559,7 @@
           <w:sz w:val="18"/>
           <w:szCs w:val="18"/>
         </w:rPr>
-        <w:t xml:space="preserve">Figure 6: Task planner with completed and outstanding tasks</w:t>
+        <w:t xml:space="preserve">Figure 6: Task planner with open and completed tasks</w:t>
       </w:r>
     </w:p>
     <w:p>
@@ -1575,7 +1575,7 @@
         <w:spacing w:after="120" w:line="276"/>
       </w:pPr>
       <w:r>
-        <w:t xml:space="preserve">This is MindLog’s signature feature. Because moods (from diary entries) and task completion times are stored in the same database, the Insights screen can relate the two. It aggregates the last fourteen days and presents a bar chart of tasks completed per day, where each bar is coloured by that day’s average mood, alongside a plain-language summary such as whether the user tends to get more done on better-mood days. This turns raw logs into actionable self-knowledge.</w:t>
+        <w:t xml:space="preserve">This is MindLog’s signature feature. Because moods (from diary entries) and task-completion times are stored in the same database, the Insights screen can relate the two. It aggregates the last fourteen days and presents a bar chart of tasks completed per day, where each bar is coloured by that day’s average mood, alongside a plain-language summary such as whether the user tends to get more done on better-mood days. This turns raw logs into actionable self-knowledge.</w:t>
       </w:r>
     </w:p>
     <w:p>
@@ -1588,7 +1588,7 @@
           <wp:inline distT="0" distB="0" distL="0" distR="0">
             <wp:extent cx="1571625" cy="3495675"/>
             <wp:effectExtent t="0" r="0" b="0" l="0"/>
-            <wp:docPr id="1" name="shot_insights.png" descr="Insights screen relating mood to tasks completed" title="Insights screen relating mood to tasks completed"/>
+            <wp:docPr id="1" name="shot_insights.png" descr="Insights screen relating mood to tasks completed over two weeks" title="Insights screen relating mood to tasks completed over two weeks"/>
             <wp:cNvGraphicFramePr>
               <a:graphicFrameLocks xmlns:a="http://schemas.openxmlformats.org/drawingml/2006/main" noChangeAspect="1"/>
             </wp:cNvGraphicFramePr>
@@ -1637,7 +1637,7 @@
           <w:sz w:val="18"/>
           <w:szCs w:val="18"/>
         </w:rPr>
-        <w:t xml:space="preserve">Figure 7: Insights screen relating mood to tasks completed</w:t>
+        <w:t xml:space="preserve">Figure 7: Insights screen relating mood to tasks completed over two weeks</w:t>
       </w:r>
     </w:p>
     <w:p>
@@ -1731,7 +1731,7 @@
         <w:spacing w:after="120" w:line="276"/>
       </w:pPr>
       <w:r>
-        <w:t xml:space="preserve">The settings screen ties several modules together. The user can switch between light, dark and system themes; enable a daily reminder and choose its time, which schedules a repeating local notification through the flutter_local_notifications plugin (requesting the notification permission on Android 13+); toggle biometric unlock; and change the passcode, which securely re-keys the encrypted database. A “load sample data” action helps with demonstration. Separately, the dashboard’s quote of the day is fetched from the ZenQuotes REST API over HTTPS, with a cached fallback so a quote always appears even when offline.</w:t>
+        <w:t xml:space="preserve">The settings screen ties several modules together. The user can switch between light, dark and system themes; enable a daily reminder and choose its time, which schedules a repeating local notification through the flutter_local_notifications plugin (requesting the notification permission on Android 13+); toggle biometric unlock; and change the passcode, which securely re-keys the encrypted database. A “Load sample data” action populates a fortnight of demo entries and tasks for demonstration. Separately, the dashboard’s quote of the day is fetched from the ZenQuotes REST API over HTTPS, with a cached fallback so a quote always appears even when offline.</w:t>
       </w:r>
     </w:p>
     <w:p>
@@ -1841,7 +1841,7 @@
         <w:spacing w:after="120" w:line="276"/>
       </w:pPr>
       <w:r>
-        <w:t xml:space="preserve">Robust and responsive. Analytics such as the mood trend and the insight chart are computed from data already held in memory, so screens update instantly without extra database round-trips. The codebase passes static analysis with no issues and is covered by unit tests for the security key-derivation logic and the data models, giving confidence in the most critical code.</w:t>
+        <w:t xml:space="preserve">Robust and tested. Analytics such as the mood trend and the insight chart are computed from data already held in memory, so screens update instantly. The codebase passes static analysis with no issues and is covered by unit and widget tests – including tests for the PBKDF2 security layer and for the mood picker across screen sizes and font scales – giving confidence in the most important code.</w:t>
       </w:r>
     </w:p>
     <w:p>
@@ -2013,15 +2013,15 @@
         <w:spacing w:after="120" w:line="276"/>
       </w:pPr>
       <w:r>
-        <w:t xml:space="preserve">I also grew more comfortable with Flutter’s widget model and state management using Provider, and with integrating plugins for biometrics, the camera, notifications and HTTP. Debugging was a real learning experience: I encountered layout errors caused by nesting a Scaffold inside an IndexedStack and by a button whose theme forced an infinite width inside a row. Tracking these down from the framework’s error output, understanding why the constraints were invalid, and fixing them taught me far more than writing the happy path did.</w:t>
-      </w:r>
-    </w:p>
-    <w:p>
-      <w:pPr>
-        <w:spacing w:after="120" w:line="276"/>
-      </w:pPr>
-      <w:r>
-        <w:t xml:space="preserve">If I were to start again, I would plan the persistence and analytics layer up front so that screens compute from in-memory data from the beginning, and I would set up a physical-device test loop earlier. Overall I am proud that the app is both feature-rich and genuinely secure, and I finish the module much more confident in mobile development.</w:t>
+        <w:t xml:space="preserve">I also grew more comfortable with Flutter’s widget model and state management using Provider, and with integrating plugins for biometrics, the camera, notifications and HTTP. Testing on a device taught me the most: I found and fixed a row of mood chips that overflowed at larger font sizes, two screens left blank by invalid layout constraints (a nested Scaffold and a button whose theme forced an infinite width), and a crash on the search screen caused by a setState callback that accidentally returned a Future. Tracking each of these down from the framework’s error output, understanding why it happened, and adding tests to guard against it taught me far more than writing the happy path did.</w:t>
+      </w:r>
+    </w:p>
+    <w:p>
+      <w:pPr>
+        <w:spacing w:after="120" w:line="276"/>
+      </w:pPr>
+      <w:r>
+        <w:t xml:space="preserve">If I were to start again, I would plan the persistence and analytics layer up front so that screens compute from in-memory data from the beginning, and I would set up a device test loop earlier to catch layout issues sooner. Overall I am proud that the app is both feature-rich and genuinely secure, and I finish the module much more confident in mobile development.</w:t>
       </w:r>
     </w:p>
     <w:p>

</xml_diff>